<commit_message>
Set quote template page size to B5 (JIS 182x257mm)
Adjust column widths and margins to fit the B5 content area.

Co-Authored-By: Claude Opus 4.8 <noreply@anthropic.com>
Claude-Session: https://claude.ai/code/session_01FmATSSm8rVRDX1JZwo8hRE
</commit_message>
<xml_diff>
--- a/報價系統/範本/報價單範本.docx
+++ b/報價系統/範本/報價單範本.docx
@@ -44,17 +44,17 @@
         <w:tblLook w:firstColumn="1" w:firstRow="1" w:lastColumn="0" w:lastRow="0" w:noHBand="0" w:noVBand="1" w:val="04A0"/>
       </w:tblPr>
       <w:tblGrid>
-        <w:gridCol w:w="1440"/>
-        <w:gridCol w:w="1440"/>
-        <w:gridCol w:w="1440"/>
-        <w:gridCol w:w="1440"/>
-        <w:gridCol w:w="1440"/>
-        <w:gridCol w:w="1440"/>
+        <w:gridCol w:w="1398"/>
+        <w:gridCol w:w="1398"/>
+        <w:gridCol w:w="1398"/>
+        <w:gridCol w:w="1398"/>
+        <w:gridCol w:w="1398"/>
+        <w:gridCol w:w="1398"/>
       </w:tblGrid>
       <w:tr>
         <w:tc>
           <w:tcPr>
-            <w:tcW w:type="dxa" w:w="1701"/>
+            <w:tcW w:type="dxa" w:w="1474"/>
           </w:tcPr>
           <w:p>
             <w:pPr>
@@ -74,7 +74,7 @@
         </w:tc>
         <w:tc>
           <w:tcPr>
-            <w:tcW w:type="dxa" w:w="2268"/>
+            <w:tcW w:type="dxa" w:w="2041"/>
           </w:tcPr>
           <w:p>
             <w:pPr>
@@ -94,7 +94,7 @@
         </w:tc>
         <w:tc>
           <w:tcPr>
-            <w:tcW w:type="dxa" w:w="1134"/>
+            <w:tcW w:type="dxa" w:w="1020"/>
           </w:tcPr>
           <w:p>
             <w:pPr>
@@ -114,7 +114,7 @@
         </w:tc>
         <w:tc>
           <w:tcPr>
-            <w:tcW w:type="dxa" w:w="1134"/>
+            <w:tcW w:type="dxa" w:w="1020"/>
           </w:tcPr>
           <w:p>
             <w:pPr>
@@ -134,7 +134,7 @@
         </w:tc>
         <w:tc>
           <w:tcPr>
-            <w:tcW w:type="dxa" w:w="1417"/>
+            <w:tcW w:type="dxa" w:w="1304"/>
           </w:tcPr>
           <w:p>
             <w:pPr>
@@ -154,7 +154,7 @@
         </w:tc>
         <w:tc>
           <w:tcPr>
-            <w:tcW w:type="dxa" w:w="1417"/>
+            <w:tcW w:type="dxa" w:w="1304"/>
           </w:tcPr>
           <w:p>
             <w:pPr>
@@ -176,7 +176,7 @@
       <w:tr>
         <w:tc>
           <w:tcPr>
-            <w:tcW w:type="dxa" w:w="1701"/>
+            <w:tcW w:type="dxa" w:w="1474"/>
           </w:tcPr>
           <w:p>
             <w:pPr>
@@ -196,31 +196,31 @@
         </w:tc>
         <w:tc>
           <w:tcPr>
-            <w:tcW w:type="dxa" w:w="2268"/>
+            <w:tcW w:type="dxa" w:w="2041"/>
           </w:tcPr>
           <w:p/>
         </w:tc>
         <w:tc>
           <w:tcPr>
-            <w:tcW w:type="dxa" w:w="1134"/>
+            <w:tcW w:type="dxa" w:w="1020"/>
           </w:tcPr>
           <w:p/>
         </w:tc>
         <w:tc>
           <w:tcPr>
-            <w:tcW w:type="dxa" w:w="1134"/>
+            <w:tcW w:type="dxa" w:w="1020"/>
           </w:tcPr>
           <w:p/>
         </w:tc>
         <w:tc>
           <w:tcPr>
-            <w:tcW w:type="dxa" w:w="1417"/>
+            <w:tcW w:type="dxa" w:w="1304"/>
           </w:tcPr>
           <w:p/>
         </w:tc>
         <w:tc>
           <w:tcPr>
-            <w:tcW w:type="dxa" w:w="1417"/>
+            <w:tcW w:type="dxa" w:w="1304"/>
           </w:tcPr>
           <w:p/>
         </w:tc>
@@ -228,7 +228,7 @@
       <w:tr>
         <w:tc>
           <w:tcPr>
-            <w:tcW w:type="dxa" w:w="1701"/>
+            <w:tcW w:type="dxa" w:w="1474"/>
           </w:tcPr>
           <w:p>
             <w:pPr>
@@ -248,7 +248,7 @@
         </w:tc>
         <w:tc>
           <w:tcPr>
-            <w:tcW w:type="dxa" w:w="2268"/>
+            <w:tcW w:type="dxa" w:w="2041"/>
           </w:tcPr>
           <w:p>
             <w:pPr>
@@ -268,7 +268,7 @@
         </w:tc>
         <w:tc>
           <w:tcPr>
-            <w:tcW w:type="dxa" w:w="1134"/>
+            <w:tcW w:type="dxa" w:w="1020"/>
           </w:tcPr>
           <w:p>
             <w:pPr>
@@ -288,7 +288,7 @@
         </w:tc>
         <w:tc>
           <w:tcPr>
-            <w:tcW w:type="dxa" w:w="1134"/>
+            <w:tcW w:type="dxa" w:w="1020"/>
           </w:tcPr>
           <w:p>
             <w:pPr>
@@ -308,7 +308,7 @@
         </w:tc>
         <w:tc>
           <w:tcPr>
-            <w:tcW w:type="dxa" w:w="1417"/>
+            <w:tcW w:type="dxa" w:w="1304"/>
           </w:tcPr>
           <w:p>
             <w:pPr>
@@ -328,7 +328,7 @@
         </w:tc>
         <w:tc>
           <w:tcPr>
-            <w:tcW w:type="dxa" w:w="1417"/>
+            <w:tcW w:type="dxa" w:w="1304"/>
           </w:tcPr>
           <w:p>
             <w:pPr>
@@ -350,7 +350,7 @@
       <w:tr>
         <w:tc>
           <w:tcPr>
-            <w:tcW w:type="dxa" w:w="1701"/>
+            <w:tcW w:type="dxa" w:w="1474"/>
           </w:tcPr>
           <w:p>
             <w:pPr>
@@ -370,31 +370,31 @@
         </w:tc>
         <w:tc>
           <w:tcPr>
-            <w:tcW w:type="dxa" w:w="2268"/>
+            <w:tcW w:type="dxa" w:w="2041"/>
           </w:tcPr>
           <w:p/>
         </w:tc>
         <w:tc>
           <w:tcPr>
-            <w:tcW w:type="dxa" w:w="1134"/>
+            <w:tcW w:type="dxa" w:w="1020"/>
           </w:tcPr>
           <w:p/>
         </w:tc>
         <w:tc>
           <w:tcPr>
-            <w:tcW w:type="dxa" w:w="1134"/>
+            <w:tcW w:type="dxa" w:w="1020"/>
           </w:tcPr>
           <w:p/>
         </w:tc>
         <w:tc>
           <w:tcPr>
-            <w:tcW w:type="dxa" w:w="1417"/>
+            <w:tcW w:type="dxa" w:w="1304"/>
           </w:tcPr>
           <w:p/>
         </w:tc>
         <w:tc>
           <w:tcPr>
-            <w:tcW w:type="dxa" w:w="1417"/>
+            <w:tcW w:type="dxa" w:w="1304"/>
           </w:tcPr>
           <w:p/>
         </w:tc>
@@ -402,7 +402,7 @@
       <w:tr>
         <w:tc>
           <w:tcPr>
-            <w:tcW w:type="dxa" w:w="2268"/>
+            <w:tcW w:type="dxa" w:w="2041"/>
             <w:gridSpan w:val="2"/>
           </w:tcPr>
           <w:p>
@@ -423,7 +423,7 @@
         </w:tc>
         <w:tc>
           <w:tcPr>
-            <w:tcW w:type="dxa" w:w="1134"/>
+            <w:tcW w:type="dxa" w:w="1020"/>
           </w:tcPr>
           <w:p>
             <w:pPr>
@@ -443,7 +443,7 @@
         </w:tc>
         <w:tc>
           <w:tcPr>
-            <w:tcW w:type="dxa" w:w="1134"/>
+            <w:tcW w:type="dxa" w:w="1020"/>
           </w:tcPr>
           <w:p>
             <w:pPr>
@@ -463,7 +463,7 @@
         </w:tc>
         <w:tc>
           <w:tcPr>
-            <w:tcW w:type="dxa" w:w="1417"/>
+            <w:tcW w:type="dxa" w:w="1304"/>
           </w:tcPr>
           <w:p>
             <w:pPr>
@@ -483,7 +483,7 @@
         </w:tc>
         <w:tc>
           <w:tcPr>
-            <w:tcW w:type="dxa" w:w="1417"/>
+            <w:tcW w:type="dxa" w:w="1304"/>
           </w:tcPr>
           <w:p>
             <w:pPr>
@@ -505,7 +505,7 @@
       <w:tr>
         <w:tc>
           <w:tcPr>
-            <w:tcW w:type="dxa" w:w="1417"/>
+            <w:tcW w:type="dxa" w:w="1304"/>
             <w:gridSpan w:val="6"/>
           </w:tcPr>
           <w:p>
@@ -615,8 +615,8 @@
       </w:r>
     </w:p>
     <w:sectPr>
-      <w:pgSz w:w="12240" w:h="15840"/>
-      <w:pgMar w:top="1440" w:right="1800" w:bottom="1440" w:left="1800" w:header="720" w:footer="720" w:gutter="0"/>
+      <w:pgSz w:w="10318" w:h="14570"/>
+      <w:pgMar w:top="1020" w:right="964" w:bottom="1020" w:left="964" w:header="720" w:footer="720" w:gutter="0"/>
       <w:cols w:space="720"/>
       <w:docGrid w:linePitch="360"/>
     </w:sectPr>

</xml_diff>